<commit_message>
Plug live GitHub repo URL into Data and Code Availability block
Replaces the placeholder "[repository URL to be finalized before submission]"
with https://github.com/ryanwongyy/role-system-ORM-submission now that the
repo is live under tag v1.0.0-ORM-submission.

Co-Authored-By: Claude Opus 4.7 (1M context) <noreply@anthropic.com>
</commit_message>
<xml_diff>
--- a/11_manuscript/10_drafts/10_manuscript.docx
+++ b/11_manuscript/10_drafts/10_manuscript.docx
@@ -3561,7 +3561,7 @@
     </w:p>
     <w:p>
       <w:r>
-        <w:t xml:space="preserve">All artifacts supporting this paper are archived at [repository URL to be finalized before submission] under release tag </w:t>
+        <w:t>All artifacts supporting this paper are archived at https://github.com/ryanwongyy/role-system-ORM-submission under release tag [</w:t>
       </w:r>
       <w:r>
         <w:rPr>
@@ -3571,7 +3571,7 @@
         <w:t>v1.0.0-ORM-submission</w:t>
       </w:r>
       <w:r>
-        <w:t xml:space="preserve">, mirrored at a Zenodo DOI to be minted on acceptance. The release contains: (1) </w:t>
+        <w:t xml:space="preserve">](https://github.com/ryanwongyy/role-system-ORM-submission/releases/tag/v1.0.0-ORM-submission), mirrored at a Zenodo DOI to be minted on acceptance. The release contains: (1) </w:t>
       </w:r>
       <w:r>
         <w:rPr>

</xml_diff>